<commit_message>
dance updates and no rehearsal 3/16
No rehearsal 3/16 due to storm
Some changes to the dances
</commit_message>
<xml_diff>
--- a/howTo26/dance/SecretaryToy choreography.docx
+++ b/howTo26/dance/SecretaryToy choreography.docx
@@ -224,28 +224,6 @@
           <w14:ligatures w14:val="none"/>
         </w:rPr>
         <w:t>After singing the second "A secretary is not", look left, look forward, look left while the Women enter on "a toy".</w:t>
-      </w:r>
-    </w:p>
-    <w:p>
-      <w:pPr>
-        <w:shd w:val="clear" w:color="auto" w:fill="FFFFFF"/>
-        <w:spacing w:after="150" w:line="240" w:lineRule="auto"/>
-        <w:ind w:left="720"/>
-        <w:rPr>
-          <w:rFonts w:ascii="Calibri" w:eastAsia="Times New Roman" w:hAnsi="Calibri" w:cs="Calibri"/>
-          <w:color w:val="333333"/>
-          <w:kern w:val="0"/>
-          <w14:ligatures w14:val="none"/>
-        </w:rPr>
-      </w:pPr>
-      <w:r>
-        <w:rPr>
-          <w:rFonts w:ascii="Calibri" w:eastAsia="Times New Roman" w:hAnsi="Calibri" w:cs="Calibri"/>
-          <w:color w:val="333333"/>
-          <w:kern w:val="0"/>
-          <w14:ligatures w14:val="none"/>
-        </w:rPr>
-        <w:t>Half the people put their right hand up when singing the first "Hooray", the other keep it down. On the second "Hooray", if you had your hand up now put it down else if you had your right hand down now put it up.</w:t>
       </w:r>
     </w:p>
     <w:p>
@@ -638,25 +616,7 @@
           <w:kern w:val="0"/>
           <w14:ligatures w14:val="none"/>
         </w:rPr>
-        <w:t>“</w:t>
-      </w:r>
-      <w:r>
-        <w:rPr>
-          <w:rFonts w:ascii="Calibri" w:eastAsia="Times New Roman" w:hAnsi="Calibri" w:cs="Calibri"/>
-          <w:color w:val="333333"/>
-          <w:kern w:val="0"/>
-          <w14:ligatures w14:val="none"/>
-        </w:rPr>
-        <w:t>S</w:t>
-      </w:r>
-      <w:r>
-        <w:rPr>
-          <w:rFonts w:ascii="Calibri" w:eastAsia="Times New Roman" w:hAnsi="Calibri" w:cs="Calibri"/>
-          <w:color w:val="333333"/>
-          <w:kern w:val="0"/>
-          <w14:ligatures w14:val="none"/>
-        </w:rPr>
-        <w:t xml:space="preserve">he’s a </w:t>
+        <w:t xml:space="preserve">“She’s a </w:t>
       </w:r>
       <w:r>
         <w:rPr>
@@ -816,16 +776,7 @@
           <w:kern w:val="0"/>
           <w14:ligatures w14:val="none"/>
         </w:rPr>
-        <w:t>ity</w:t>
-      </w:r>
-      <w:r>
-        <w:rPr>
-          <w:rFonts w:ascii="Calibri" w:eastAsia="Times New Roman" w:hAnsi="Calibri" w:cs="Calibri"/>
-          <w:color w:val="333333"/>
-          <w:kern w:val="0"/>
-          <w14:ligatures w14:val="none"/>
-        </w:rPr>
-        <w:t>.”</w:t>
+        <w:t>ity.”</w:t>
       </w:r>
     </w:p>
     <w:p>
@@ -1057,25 +1008,7 @@
           <w:kern w:val="0"/>
           <w14:ligatures w14:val="none"/>
         </w:rPr>
-        <w:t xml:space="preserve">After “community” move </w:t>
-      </w:r>
-      <w:r>
-        <w:rPr>
-          <w:rFonts w:ascii="Calibri" w:eastAsia="Times New Roman" w:hAnsi="Calibri" w:cs="Calibri"/>
-          <w:color w:val="333333"/>
-          <w:kern w:val="0"/>
-          <w14:ligatures w14:val="none"/>
-        </w:rPr>
-        <w:t>downstage</w:t>
-      </w:r>
-      <w:r>
-        <w:rPr>
-          <w:rFonts w:ascii="Calibri" w:eastAsia="Times New Roman" w:hAnsi="Calibri" w:cs="Calibri"/>
-          <w:color w:val="333333"/>
-          <w:kern w:val="0"/>
-          <w14:ligatures w14:val="none"/>
-        </w:rPr>
-        <w:t xml:space="preserve"> left behind Bud. Be in place by "With a mother …"</w:t>
+        <w:t>After “community” move downstage left behind Bud. Be in place by "With a mother …"</w:t>
       </w:r>
     </w:p>
     <w:p>
@@ -1098,7 +1031,6 @@
           <w:u w:val="single"/>
           <w14:ligatures w14:val="none"/>
         </w:rPr>
-        <w:lastRenderedPageBreak/>
         <w:t>Women</w:t>
       </w:r>
       <w:r>
@@ -1181,6 +1113,7 @@
           <w:kern w:val="0"/>
           <w14:ligatures w14:val="none"/>
         </w:rPr>
+        <w:lastRenderedPageBreak/>
         <w:t>At </w:t>
       </w:r>
       <w:r>
@@ -1579,19 +1512,28 @@
           <w:rFonts w:ascii="Calibri" w:eastAsia="Times New Roman" w:hAnsi="Calibri" w:cs="Calibri"/>
           <w:color w:val="333333"/>
           <w:kern w:val="0"/>
+          <w14:ligatures w14:val="none"/>
+        </w:rPr>
+        <w:t xml:space="preserve">First </w:t>
+      </w:r>
+      <w:r>
+        <w:rPr>
+          <w:rFonts w:ascii="Calibri" w:eastAsia="Times New Roman" w:hAnsi="Calibri" w:cs="Calibri"/>
+          <w:color w:val="333333"/>
+          <w:kern w:val="0"/>
           <w:u w:val="single"/>
           <w14:ligatures w14:val="none"/>
         </w:rPr>
-        <w:t>Men</w:t>
-      </w:r>
-      <w:r>
-        <w:rPr>
-          <w:rFonts w:ascii="Calibri" w:eastAsia="Times New Roman" w:hAnsi="Calibri" w:cs="Calibri"/>
-          <w:color w:val="333333"/>
-          <w:kern w:val="0"/>
-          <w14:ligatures w14:val="none"/>
-        </w:rPr>
-        <w:t>: spin the left</w:t>
+        <w:t>Women</w:t>
+      </w:r>
+      <w:r>
+        <w:rPr>
+          <w:rFonts w:ascii="Calibri" w:eastAsia="Times New Roman" w:hAnsi="Calibri" w:cs="Calibri"/>
+          <w:color w:val="333333"/>
+          <w:kern w:val="0"/>
+          <w14:ligatures w14:val="none"/>
+        </w:rPr>
+        <w:t xml:space="preserve"> spin to the right</w:t>
       </w:r>
     </w:p>
     <w:p>
@@ -1615,19 +1557,28 @@
           <w:rFonts w:ascii="Calibri" w:eastAsia="Times New Roman" w:hAnsi="Calibri" w:cs="Calibri"/>
           <w:color w:val="333333"/>
           <w:kern w:val="0"/>
+          <w14:ligatures w14:val="none"/>
+        </w:rPr>
+        <w:t xml:space="preserve">Then </w:t>
+      </w:r>
+      <w:r>
+        <w:rPr>
+          <w:rFonts w:ascii="Calibri" w:eastAsia="Times New Roman" w:hAnsi="Calibri" w:cs="Calibri"/>
+          <w:color w:val="333333"/>
+          <w:kern w:val="0"/>
           <w:u w:val="single"/>
           <w14:ligatures w14:val="none"/>
         </w:rPr>
-        <w:t>Women</w:t>
-      </w:r>
-      <w:r>
-        <w:rPr>
-          <w:rFonts w:ascii="Calibri" w:eastAsia="Times New Roman" w:hAnsi="Calibri" w:cs="Calibri"/>
-          <w:color w:val="333333"/>
-          <w:kern w:val="0"/>
-          <w14:ligatures w14:val="none"/>
-        </w:rPr>
-        <w:t>: spin to the right</w:t>
+        <w:t>Men</w:t>
+      </w:r>
+      <w:r>
+        <w:rPr>
+          <w:rFonts w:ascii="Calibri" w:eastAsia="Times New Roman" w:hAnsi="Calibri" w:cs="Calibri"/>
+          <w:color w:val="333333"/>
+          <w:kern w:val="0"/>
+          <w14:ligatures w14:val="none"/>
+        </w:rPr>
+        <w:t xml:space="preserve"> spin the left</w:t>
       </w:r>
     </w:p>
     <w:p>
@@ -1802,6 +1753,56 @@
     </w:p>
     <w:p>
       <w:pPr>
+        <w:numPr>
+          <w:ilvl w:val="2"/>
+          <w:numId w:val="9"/>
+        </w:numPr>
+        <w:shd w:val="clear" w:color="auto" w:fill="FFFFFF"/>
+        <w:spacing w:before="100" w:beforeAutospacing="1" w:after="100" w:afterAutospacing="1" w:line="240" w:lineRule="auto"/>
+        <w:rPr>
+          <w:rFonts w:ascii="Calibri" w:eastAsia="Times New Roman" w:hAnsi="Calibri" w:cs="Calibri"/>
+          <w:color w:val="333333"/>
+          <w:kern w:val="0"/>
+          <w14:ligatures w14:val="none"/>
+        </w:rPr>
+      </w:pPr>
+      <w:r>
+        <w:rPr>
+          <w:rFonts w:ascii="Calibri" w:eastAsia="Times New Roman" w:hAnsi="Calibri" w:cs="Calibri"/>
+          <w:color w:val="333333"/>
+          <w:kern w:val="0"/>
+          <w14:ligatures w14:val="none"/>
+        </w:rPr>
+        <w:t>8 - Grapevine steps to the left</w:t>
+      </w:r>
+    </w:p>
+    <w:p>
+      <w:pPr>
+        <w:numPr>
+          <w:ilvl w:val="2"/>
+          <w:numId w:val="9"/>
+        </w:numPr>
+        <w:shd w:val="clear" w:color="auto" w:fill="FFFFFF"/>
+        <w:spacing w:before="100" w:beforeAutospacing="1" w:after="100" w:afterAutospacing="1" w:line="240" w:lineRule="auto"/>
+        <w:rPr>
+          <w:rFonts w:ascii="Calibri" w:eastAsia="Times New Roman" w:hAnsi="Calibri" w:cs="Calibri"/>
+          <w:color w:val="333333"/>
+          <w:kern w:val="0"/>
+          <w14:ligatures w14:val="none"/>
+        </w:rPr>
+      </w:pPr>
+      <w:r>
+        <w:rPr>
+          <w:rFonts w:ascii="Calibri" w:eastAsia="Times New Roman" w:hAnsi="Calibri" w:cs="Calibri"/>
+          <w:color w:val="333333"/>
+          <w:kern w:val="0"/>
+          <w14:ligatures w14:val="none"/>
+        </w:rPr>
+        <w:t>8 - Grapevine steps to the right</w:t>
+      </w:r>
+    </w:p>
+    <w:p>
+      <w:pPr>
         <w:pStyle w:val="ListParagraph"/>
         <w:numPr>
           <w:ilvl w:val="1"/>
@@ -1928,6 +1929,56 @@
     </w:p>
     <w:p>
       <w:pPr>
+        <w:numPr>
+          <w:ilvl w:val="2"/>
+          <w:numId w:val="9"/>
+        </w:numPr>
+        <w:shd w:val="clear" w:color="auto" w:fill="FFFFFF"/>
+        <w:spacing w:before="100" w:beforeAutospacing="1" w:after="100" w:afterAutospacing="1" w:line="240" w:lineRule="auto"/>
+        <w:rPr>
+          <w:rFonts w:ascii="Calibri" w:eastAsia="Times New Roman" w:hAnsi="Calibri" w:cs="Calibri"/>
+          <w:color w:val="333333"/>
+          <w:kern w:val="0"/>
+          <w14:ligatures w14:val="none"/>
+        </w:rPr>
+      </w:pPr>
+      <w:r>
+        <w:rPr>
+          <w:rFonts w:ascii="Calibri" w:eastAsia="Times New Roman" w:hAnsi="Calibri" w:cs="Calibri"/>
+          <w:color w:val="333333"/>
+          <w:kern w:val="0"/>
+          <w14:ligatures w14:val="none"/>
+        </w:rPr>
+        <w:t>8 - Grapevine steps to the right</w:t>
+      </w:r>
+    </w:p>
+    <w:p>
+      <w:pPr>
+        <w:numPr>
+          <w:ilvl w:val="2"/>
+          <w:numId w:val="9"/>
+        </w:numPr>
+        <w:shd w:val="clear" w:color="auto" w:fill="FFFFFF"/>
+        <w:spacing w:before="100" w:beforeAutospacing="1" w:after="100" w:afterAutospacing="1" w:line="240" w:lineRule="auto"/>
+        <w:rPr>
+          <w:rFonts w:ascii="Calibri" w:eastAsia="Times New Roman" w:hAnsi="Calibri" w:cs="Calibri"/>
+          <w:color w:val="333333"/>
+          <w:kern w:val="0"/>
+          <w14:ligatures w14:val="none"/>
+        </w:rPr>
+      </w:pPr>
+      <w:r>
+        <w:rPr>
+          <w:rFonts w:ascii="Calibri" w:eastAsia="Times New Roman" w:hAnsi="Calibri" w:cs="Calibri"/>
+          <w:color w:val="333333"/>
+          <w:kern w:val="0"/>
+          <w14:ligatures w14:val="none"/>
+        </w:rPr>
+        <w:t>8 - Grapevine steps to the left</w:t>
+      </w:r>
+    </w:p>
+    <w:p>
+      <w:pPr>
         <w:shd w:val="clear" w:color="auto" w:fill="FFFFFF"/>
         <w:spacing w:after="0" w:line="240" w:lineRule="auto"/>
         <w:ind w:left="720"/>
@@ -1955,25 +2006,7 @@
           <w:kern w:val="0"/>
           <w14:ligatures w14:val="none"/>
         </w:rPr>
-        <w:t xml:space="preserve"> during second </w:t>
-      </w:r>
-      <w:r>
-        <w:rPr>
-          <w:rFonts w:ascii="Calibri" w:eastAsia="Times New Roman" w:hAnsi="Calibri" w:cs="Calibri"/>
-          <w:color w:val="333333"/>
-          <w:kern w:val="0"/>
-          <w14:ligatures w14:val="none"/>
-        </w:rPr>
-        <w:t>whistling</w:t>
-      </w:r>
-      <w:r>
-        <w:rPr>
-          <w:rFonts w:ascii="Calibri" w:eastAsia="Times New Roman" w:hAnsi="Calibri" w:cs="Calibri"/>
-          <w:color w:val="333333"/>
-          <w:kern w:val="0"/>
-          <w14:ligatures w14:val="none"/>
-        </w:rPr>
-        <w:t xml:space="preserve"> line</w:t>
+        <w:t> during second whistling line</w:t>
       </w:r>
     </w:p>
     <w:p>
@@ -2801,17 +2834,24 @@
         </w:rPr>
         <w:t>Men</w:t>
       </w:r>
-      <w:proofErr w:type="gramStart"/>
-      <w:r>
-        <w:rPr>
-          <w:rFonts w:ascii="Calibri" w:eastAsia="Times New Roman" w:hAnsi="Calibri" w:cs="Calibri"/>
-          <w:color w:val="333333"/>
-          <w:kern w:val="0"/>
-          <w14:ligatures w14:val="none"/>
-        </w:rPr>
-        <w:t>: ?</w:t>
-      </w:r>
-      <w:proofErr w:type="gramEnd"/>
+      <w:r>
+        <w:rPr>
+          <w:rFonts w:ascii="Calibri" w:eastAsia="Times New Roman" w:hAnsi="Calibri" w:cs="Calibri"/>
+          <w:color w:val="333333"/>
+          <w:kern w:val="0"/>
+          <w14:ligatures w14:val="none"/>
+        </w:rPr>
+        <w:t xml:space="preserve">: </w:t>
+      </w:r>
+      <w:r>
+        <w:rPr>
+          <w:rFonts w:ascii="Calibri" w:eastAsia="Times New Roman" w:hAnsi="Calibri" w:cs="Calibri"/>
+          <w:color w:val="333333"/>
+          <w:kern w:val="0"/>
+          <w14:ligatures w14:val="none"/>
+        </w:rPr>
+        <w:t>Follow Hedy upstage and exit.</w:t>
+      </w:r>
     </w:p>
     <w:p>
       <w:pPr>

</xml_diff>